<commit_message>
docs: actualizar ERS y planilla con detalle, carrito y login implementados
Se agregan RF-06 a RF-08, se marcan R.1, R.4, R.5 y R.9 como completados
y se agrega la columna de criterios de aceptacion en formato Dado/Cuando/Entonces.

Co-Authored-By: Claude Sonnet 5 <noreply@anthropic.com>
</commit_message>
<xml_diff>
--- a/ALBEDO_ERS_Version_1_Parcial.docx
+++ b/ALBEDO_ERS_Version_1_Parcial.docx
@@ -125,50 +125,8 @@
                         <w:sz w:val="80"/>
                         <w:szCs w:val="80"/>
                       </w:rPr>
-                      <w:t xml:space="preserve">Especificación de Requisitos de Software </w:t>
+                      <w:t xml:space="preserve">Especificación de Requisitos de Software – Proyecto ALBEDO Outdoor</w:t>
                     </w:r>
-                    <w:r>
-                      <w:rPr>
-                        <w:rFonts w:eastAsiaTheme="majorEastAsia" w:cstheme="minorHAnsi"/>
-                        <w:sz w:val="80"/>
-                        <w:szCs w:val="80"/>
-                      </w:rPr>
-                      <w:t>–</w:t>
-                    </w:r>
-                    <w:r>
-                      <w:rPr>
-                        <w:rFonts w:eastAsiaTheme="majorEastAsia" w:cstheme="minorHAnsi"/>
-                        <w:sz w:val="80"/>
-                        <w:szCs w:val="80"/>
-                      </w:rPr>
-                      <w:t xml:space="preserve"> </w:t>
-                    </w:r>
-                    <w:r>
-                      <w:rPr>
-                        <w:rFonts w:eastAsiaTheme="majorEastAsia" w:cstheme="minorHAnsi"/>
-                        <w:sz w:val="80"/>
-                        <w:szCs w:val="80"/>
-                      </w:rPr>
-                      <w:t xml:space="preserve">Proyecto </w:t>
-                    </w:r>
-                    <w:r>
-                      <w:rPr>
-                        <w:rFonts w:eastAsiaTheme="majorEastAsia" w:cstheme="minorHAnsi"/>
-                        <w:sz w:val="80"/>
-                        <w:szCs w:val="80"/>
-                      </w:rPr>
-                      <w:t xml:space="preserve">ALBEDO </w:t>
-                    </w:r>
-                    <w:proofErr w:type="spellStart"/>
-                    <w:r>
-                      <w:rPr>
-                        <w:rFonts w:eastAsiaTheme="majorEastAsia" w:cstheme="minorHAnsi"/>
-                        <w:sz w:val="80"/>
-                        <w:szCs w:val="80"/>
-                      </w:rPr>
-                      <w:t>Outdoor</w:t>
-                    </w:r>
-                    <w:proofErr w:type="spellEnd"/>
                   </w:p>
                 </w:tc>
               </w:sdtContent>
@@ -338,7 +296,7 @@
               <wp:inline distT="0" distB="0" distL="0" distR="0" wp14:anchorId="63C4AC39" wp14:editId="0B0FE7D1">
                 <wp:extent cx="4058216" cy="2095792"/>
                 <wp:effectExtent l="0" t="0" r="0" b="0"/>
-                <wp:docPr id="132742347" name="Imagen 1" descr="Logotipo&#10;&#10;Descripción generada automáticamente"/>
+                <wp:docPr id="132742347" name="Imagen 1" descr="Logotipo  Descripción generada automáticamente"/>
                 <wp:cNvGraphicFramePr>
                   <a:graphicFrameLocks xmlns:a="http://schemas.openxmlformats.org/drawingml/2006/main" noChangeAspect="1"/>
                 </wp:cNvGraphicFramePr>
@@ -346,7 +304,7 @@
                   <a:graphicData uri="http://schemas.openxmlformats.org/drawingml/2006/picture">
                     <pic:pic xmlns:pic="http://schemas.openxmlformats.org/drawingml/2006/picture">
                       <pic:nvPicPr>
-                        <pic:cNvPr id="132742347" name="Imagen 1" descr="Logotipo&#10;&#10;Descripción generada automáticamente"/>
+                        <pic:cNvPr id="132742347" name="Imagen 1" descr="Logotipo  Descripción generada automáticamente"/>
                         <pic:cNvPicPr/>
                       </pic:nvPicPr>
                       <pic:blipFill>
@@ -383,23 +341,8 @@
               <w:rFonts w:cstheme="minorHAnsi"/>
             </w:rPr>
             <w:tab/>
-          </w:r>
-          <w:r>
-            <w:rPr>
-              <w:rFonts w:cstheme="minorHAnsi"/>
-            </w:rPr>
             <w:tab/>
-          </w:r>
-          <w:r>
-            <w:rPr>
-              <w:rFonts w:cstheme="minorHAnsi"/>
-            </w:rPr>
             <w:tab/>
-          </w:r>
-          <w:r>
-            <w:rPr>
-              <w:rFonts w:cstheme="minorHAnsi"/>
-            </w:rPr>
             <w:tab/>
           </w:r>
         </w:p>
@@ -423,59 +366,14 @@
               <w:rFonts w:cstheme="minorHAnsi"/>
             </w:rPr>
             <w:tab/>
-          </w:r>
-          <w:r>
-            <w:rPr>
-              <w:rFonts w:cstheme="minorHAnsi"/>
-            </w:rPr>
             <w:tab/>
-          </w:r>
-          <w:r>
-            <w:rPr>
-              <w:rFonts w:cstheme="minorHAnsi"/>
-            </w:rPr>
             <w:tab/>
-          </w:r>
-          <w:r>
-            <w:rPr>
-              <w:rFonts w:cstheme="minorHAnsi"/>
-            </w:rPr>
             <w:tab/>
-          </w:r>
-          <w:r>
-            <w:rPr>
-              <w:rFonts w:cstheme="minorHAnsi"/>
-            </w:rPr>
             <w:tab/>
-          </w:r>
-          <w:r>
-            <w:rPr>
-              <w:rFonts w:cstheme="minorHAnsi"/>
-            </w:rPr>
             <w:tab/>
-          </w:r>
-          <w:r>
-            <w:rPr>
-              <w:rFonts w:cstheme="minorHAnsi"/>
-            </w:rPr>
             <w:tab/>
-          </w:r>
-          <w:r>
-            <w:rPr>
-              <w:rFonts w:cstheme="minorHAnsi"/>
-            </w:rPr>
             <w:tab/>
-          </w:r>
-          <w:r>
-            <w:rPr>
-              <w:rFonts w:cstheme="minorHAnsi"/>
-            </w:rPr>
             <w:tab/>
-          </w:r>
-          <w:r>
-            <w:rPr>
-              <w:rFonts w:cstheme="minorHAnsi"/>
-            </w:rPr>
             <w:tab/>
             <w:t>Luis Roa</w:t>
           </w:r>
@@ -492,59 +390,14 @@
               <w:rFonts w:cstheme="minorHAnsi"/>
             </w:rPr>
             <w:tab/>
-          </w:r>
-          <w:r>
-            <w:rPr>
-              <w:rFonts w:cstheme="minorHAnsi"/>
-            </w:rPr>
             <w:tab/>
-          </w:r>
-          <w:r>
-            <w:rPr>
-              <w:rFonts w:cstheme="minorHAnsi"/>
-            </w:rPr>
             <w:tab/>
-          </w:r>
-          <w:r>
-            <w:rPr>
-              <w:rFonts w:cstheme="minorHAnsi"/>
-            </w:rPr>
             <w:tab/>
-          </w:r>
-          <w:r>
-            <w:rPr>
-              <w:rFonts w:cstheme="minorHAnsi"/>
-            </w:rPr>
             <w:tab/>
-          </w:r>
-          <w:r>
-            <w:rPr>
-              <w:rFonts w:cstheme="minorHAnsi"/>
-            </w:rPr>
             <w:tab/>
-          </w:r>
-          <w:r>
-            <w:rPr>
-              <w:rFonts w:cstheme="minorHAnsi"/>
-            </w:rPr>
             <w:tab/>
-          </w:r>
-          <w:r>
-            <w:rPr>
-              <w:rFonts w:cstheme="minorHAnsi"/>
-            </w:rPr>
             <w:tab/>
-          </w:r>
-          <w:r>
-            <w:rPr>
-              <w:rFonts w:cstheme="minorHAnsi"/>
-            </w:rPr>
             <w:tab/>
-          </w:r>
-          <w:r>
-            <w:rPr>
-              <w:rFonts w:cstheme="minorHAnsi"/>
-            </w:rPr>
             <w:tab/>
             <w:t>Claudio Córdova</w:t>
           </w:r>
@@ -1077,10 +930,7 @@
           </w:tcPr>
           <w:p>
             <w:r>
-              <w:t>09</w:t>
-            </w:r>
-            <w:r>
-              <w:t>-09-2026</w:t>
+              <w:t>09-09-2026</w:t>
             </w:r>
           </w:p>
         </w:tc>
@@ -1154,10 +1004,7 @@
           </w:tcPr>
           <w:p>
             <w:r>
-              <w:t>13</w:t>
-            </w:r>
-            <w:r>
-              <w:t>-09-2026</w:t>
+              <w:t>13-09-2026</w:t>
             </w:r>
           </w:p>
         </w:tc>
@@ -1174,10 +1021,7 @@
           </w:tcPr>
           <w:p>
             <w:r>
-              <w:t>2</w:t>
-            </w:r>
-            <w:r>
-              <w:t>.0</w:t>
+              <w:t>2.0</w:t>
             </w:r>
           </w:p>
         </w:tc>
@@ -1234,13 +1078,7 @@
           </w:tcPr>
           <w:p>
             <w:r>
-              <w:t>1</w:t>
-            </w:r>
-            <w:r>
-              <w:t>4</w:t>
-            </w:r>
-            <w:r>
-              <w:t>-09-2026</w:t>
+              <w:t>14-09-2026</w:t>
             </w:r>
           </w:p>
         </w:tc>
@@ -1913,7 +1751,7 @@
         <w:ind w:left="340" w:hanging="170"/>
       </w:pPr>
       <w:r>
-        <w:t>• Registro de usuario e inicio de sesión con sus validaciones.</w:t>
+        <w:t>• Registro de usuario con sus validaciones.</w:t>
       </w:r>
     </w:p>
     <w:p>
@@ -1934,26 +1772,6 @@
       </w:pPr>
       <w:r>
         <w:t>• Blog y dos vistas de detalle de blog.</w:t>
-      </w:r>
-    </w:p>
-    <w:p>
-      <w:pPr>
-        <w:pStyle w:val="Prrafodelista"/>
-        <w:spacing w:after="60"/>
-        <w:ind w:left="340" w:hanging="170"/>
-      </w:pPr>
-      <w:r>
-        <w:t>• Detalle de producto y botón para añadir productos.</w:t>
-      </w:r>
-    </w:p>
-    <w:p>
-      <w:pPr>
-        <w:pStyle w:val="Prrafodelista"/>
-        <w:spacing w:after="60"/>
-        <w:ind w:left="340" w:hanging="170"/>
-      </w:pPr>
-      <w:r>
-        <w:t>• Carrito de compras con persistencia en localStorage.</w:t>
       </w:r>
     </w:p>
     <w:p>
@@ -2745,6 +2563,309 @@
                 <w:sz w:val="18"/>
               </w:rPr>
               <w:t>El sistema debe validar con JavaScript: nombre requerido (máx. 100), correo de máx. 100 con dominios @duoc.cl, @profesor.duoc.cl o @gmail.com, y comentario requerido (máx. 500). Debe mostrar mensajes de error o confirmación.</w:t>
+            </w:r>
+          </w:p>
+        </w:tc>
+        <w:tc>
+          <w:tcPr>
+            <w:tcW w:w="1361" w:type="dxa"/>
+            <w:tcMar>
+              <w:top w:w="60" w:type="dxa"/>
+              <w:left w:w="60" w:type="dxa"/>
+              <w:bottom w:w="60" w:type="dxa"/>
+              <w:right w:w="60" w:type="dxa"/>
+            </w:tcMar>
+          </w:tcPr>
+          <w:p>
+            <w:r>
+              <w:rPr>
+                <w:sz w:val="18"/>
+              </w:rPr>
+              <w:t>Implementado</w:t>
+            </w:r>
+          </w:p>
+        </w:tc>
+      </w:tr>
+      <w:tr>
+        <w:trPr>
+          <w:cantSplit/>
+          <w:jc w:val="center"/>
+        </w:trPr>
+        <w:tc>
+          <w:tcPr>
+            <w:tcW w:w="850" w:type="dxa"/>
+            <w:tcMar>
+              <w:top w:w="60" w:type="dxa"/>
+              <w:left w:w="60" w:type="dxa"/>
+              <w:bottom w:w="60" w:type="dxa"/>
+              <w:right w:w="60" w:type="dxa"/>
+            </w:tcMar>
+          </w:tcPr>
+          <w:p>
+            <w:r>
+              <w:rPr>
+                <w:sz w:val="18"/>
+              </w:rPr>
+              <w:t>RF-06</w:t>
+            </w:r>
+          </w:p>
+        </w:tc>
+        <w:tc>
+          <w:tcPr>
+            <w:tcW w:w="1928" w:type="dxa"/>
+            <w:tcMar>
+              <w:top w:w="60" w:type="dxa"/>
+              <w:left w:w="60" w:type="dxa"/>
+              <w:bottom w:w="60" w:type="dxa"/>
+              <w:right w:w="60" w:type="dxa"/>
+            </w:tcMar>
+          </w:tcPr>
+          <w:p>
+            <w:r>
+              <w:rPr>
+                <w:sz w:val="18"/>
+              </w:rPr>
+              <w:t>Detalle de producto</w:t>
+            </w:r>
+          </w:p>
+        </w:tc>
+        <w:tc>
+          <w:tcPr>
+            <w:tcW w:w="1304" w:type="dxa"/>
+            <w:tcMar>
+              <w:top w:w="60" w:type="dxa"/>
+              <w:left w:w="60" w:type="dxa"/>
+              <w:bottom w:w="60" w:type="dxa"/>
+              <w:right w:w="60" w:type="dxa"/>
+            </w:tcMar>
+          </w:tcPr>
+          <w:p>
+            <w:r>
+              <w:rPr>
+                <w:sz w:val="18"/>
+              </w:rPr>
+              <w:t>Cliente</w:t>
+            </w:r>
+          </w:p>
+        </w:tc>
+        <w:tc>
+          <w:tcPr>
+            <w:tcW w:w="5272" w:type="dxa"/>
+            <w:tcMar>
+              <w:top w:w="60" w:type="dxa"/>
+              <w:left w:w="60" w:type="dxa"/>
+              <w:bottom w:w="60" w:type="dxa"/>
+              <w:right w:w="60" w:type="dxa"/>
+            </w:tcMar>
+          </w:tcPr>
+          <w:p>
+            <w:r>
+              <w:rPr>
+                <w:sz w:val="18"/>
+              </w:rPr>
+              <w:t>El sistema debe redireccionar a una vista de detalle al seleccionar un producto desde el catálogo, mostrando su imagen, nombre, precio, descripción y colores disponibles, junto con un botón para añadirlo al carrito de compras.</w:t>
+            </w:r>
+          </w:p>
+        </w:tc>
+        <w:tc>
+          <w:tcPr>
+            <w:tcW w:w="1361" w:type="dxa"/>
+            <w:tcMar>
+              <w:top w:w="60" w:type="dxa"/>
+              <w:left w:w="60" w:type="dxa"/>
+              <w:bottom w:w="60" w:type="dxa"/>
+              <w:right w:w="60" w:type="dxa"/>
+            </w:tcMar>
+          </w:tcPr>
+          <w:p>
+            <w:r>
+              <w:rPr>
+                <w:sz w:val="18"/>
+              </w:rPr>
+              <w:t>Implementado</w:t>
+            </w:r>
+          </w:p>
+        </w:tc>
+      </w:tr>
+      <w:tr>
+        <w:trPr>
+          <w:cantSplit/>
+          <w:jc w:val="center"/>
+        </w:trPr>
+        <w:tc>
+          <w:tcPr>
+            <w:tcW w:w="850" w:type="dxa"/>
+            <w:tcMar>
+              <w:top w:w="60" w:type="dxa"/>
+              <w:left w:w="60" w:type="dxa"/>
+              <w:bottom w:w="60" w:type="dxa"/>
+              <w:right w:w="60" w:type="dxa"/>
+            </w:tcMar>
+          </w:tcPr>
+          <w:p>
+            <w:r>
+              <w:rPr>
+                <w:sz w:val="18"/>
+              </w:rPr>
+              <w:t>RF-07</w:t>
+            </w:r>
+          </w:p>
+        </w:tc>
+        <w:tc>
+          <w:tcPr>
+            <w:tcW w:w="1928" w:type="dxa"/>
+            <w:tcMar>
+              <w:top w:w="60" w:type="dxa"/>
+              <w:left w:w="60" w:type="dxa"/>
+              <w:bottom w:w="60" w:type="dxa"/>
+              <w:right w:w="60" w:type="dxa"/>
+            </w:tcMar>
+          </w:tcPr>
+          <w:p>
+            <w:r>
+              <w:rPr>
+                <w:sz w:val="18"/>
+              </w:rPr>
+              <w:t>Carrito de compras</w:t>
+            </w:r>
+          </w:p>
+        </w:tc>
+        <w:tc>
+          <w:tcPr>
+            <w:tcW w:w="1304" w:type="dxa"/>
+            <w:tcMar>
+              <w:top w:w="60" w:type="dxa"/>
+              <w:left w:w="60" w:type="dxa"/>
+              <w:bottom w:w="60" w:type="dxa"/>
+              <w:right w:w="60" w:type="dxa"/>
+            </w:tcMar>
+          </w:tcPr>
+          <w:p>
+            <w:r>
+              <w:rPr>
+                <w:sz w:val="18"/>
+              </w:rPr>
+              <w:t>Cliente</w:t>
+            </w:r>
+          </w:p>
+        </w:tc>
+        <w:tc>
+          <w:tcPr>
+            <w:tcW w:w="5272" w:type="dxa"/>
+            <w:tcMar>
+              <w:top w:w="60" w:type="dxa"/>
+              <w:left w:w="60" w:type="dxa"/>
+              <w:bottom w:w="60" w:type="dxa"/>
+              <w:right w:w="60" w:type="dxa"/>
+            </w:tcMar>
+          </w:tcPr>
+          <w:p>
+            <w:r>
+              <w:rPr>
+                <w:sz w:val="18"/>
+              </w:rPr>
+              <w:t>El sistema debe permitir añadir productos al carrito, modificar la cantidad, eliminar productos y vaciar el carrito, manteniendo la información del carrito mediante localStorage.</w:t>
+            </w:r>
+          </w:p>
+        </w:tc>
+        <w:tc>
+          <w:tcPr>
+            <w:tcW w:w="1361" w:type="dxa"/>
+            <w:tcMar>
+              <w:top w:w="60" w:type="dxa"/>
+              <w:left w:w="60" w:type="dxa"/>
+              <w:bottom w:w="60" w:type="dxa"/>
+              <w:right w:w="60" w:type="dxa"/>
+            </w:tcMar>
+          </w:tcPr>
+          <w:p>
+            <w:r>
+              <w:rPr>
+                <w:sz w:val="18"/>
+              </w:rPr>
+              <w:t>Implementado</w:t>
+            </w:r>
+          </w:p>
+        </w:tc>
+      </w:tr>
+      <w:tr>
+        <w:trPr>
+          <w:cantSplit/>
+          <w:jc w:val="center"/>
+        </w:trPr>
+        <w:tc>
+          <w:tcPr>
+            <w:tcW w:w="850" w:type="dxa"/>
+            <w:tcMar>
+              <w:top w:w="60" w:type="dxa"/>
+              <w:left w:w="60" w:type="dxa"/>
+              <w:bottom w:w="60" w:type="dxa"/>
+              <w:right w:w="60" w:type="dxa"/>
+            </w:tcMar>
+          </w:tcPr>
+          <w:p>
+            <w:r>
+              <w:rPr>
+                <w:sz w:val="18"/>
+              </w:rPr>
+              <w:t>RF-08</w:t>
+            </w:r>
+          </w:p>
+        </w:tc>
+        <w:tc>
+          <w:tcPr>
+            <w:tcW w:w="1928" w:type="dxa"/>
+            <w:tcMar>
+              <w:top w:w="60" w:type="dxa"/>
+              <w:left w:w="60" w:type="dxa"/>
+              <w:bottom w:w="60" w:type="dxa"/>
+              <w:right w:w="60" w:type="dxa"/>
+            </w:tcMar>
+          </w:tcPr>
+          <w:p>
+            <w:r>
+              <w:rPr>
+                <w:sz w:val="18"/>
+              </w:rPr>
+              <w:t>Inicio de sesión</w:t>
+            </w:r>
+          </w:p>
+        </w:tc>
+        <w:tc>
+          <w:tcPr>
+            <w:tcW w:w="1304" w:type="dxa"/>
+            <w:tcMar>
+              <w:top w:w="60" w:type="dxa"/>
+              <w:left w:w="60" w:type="dxa"/>
+              <w:bottom w:w="60" w:type="dxa"/>
+              <w:right w:w="60" w:type="dxa"/>
+            </w:tcMar>
+          </w:tcPr>
+          <w:p>
+            <w:r>
+              <w:rPr>
+                <w:sz w:val="18"/>
+              </w:rPr>
+              <w:t>Cliente</w:t>
+            </w:r>
+          </w:p>
+        </w:tc>
+        <w:tc>
+          <w:tcPr>
+            <w:tcW w:w="5272" w:type="dxa"/>
+            <w:tcMar>
+              <w:top w:w="60" w:type="dxa"/>
+              <w:left w:w="60" w:type="dxa"/>
+              <w:bottom w:w="60" w:type="dxa"/>
+              <w:right w:w="60" w:type="dxa"/>
+            </w:tcMar>
+          </w:tcPr>
+          <w:p>
+            <w:r>
+              <w:rPr>
+                <w:sz w:val="18"/>
+              </w:rPr>
+              <w:t>El sistema debe validar con JavaScript el inicio de sesión: correo requerido de máximo 100 caracteres con dominios @duoc.cl, @profesor.duoc.cl o @gmail.com, y contraseña requerida de entre 4 y 10 caracteres. Debe mostrar mensajes de error o confirmación.</w:t>
             </w:r>
           </w:p>
         </w:tc>

</xml_diff>

<commit_message>
Agrega carrito, login y detalle de productos
</commit_message>
<xml_diff>
--- a/ALBEDO_ERS_Version_1_Parcial.docx
+++ b/ALBEDO_ERS_Version_1_Parcial.docx
@@ -125,50 +125,8 @@
                         <w:sz w:val="80"/>
                         <w:szCs w:val="80"/>
                       </w:rPr>
-                      <w:t xml:space="preserve">Especificación de Requisitos de Software </w:t>
+                      <w:t xml:space="preserve">Especificación de Requisitos de Software – Proyecto ALBEDO Outdoor</w:t>
                     </w:r>
-                    <w:r>
-                      <w:rPr>
-                        <w:rFonts w:eastAsiaTheme="majorEastAsia" w:cstheme="minorHAnsi"/>
-                        <w:sz w:val="80"/>
-                        <w:szCs w:val="80"/>
-                      </w:rPr>
-                      <w:t>–</w:t>
-                    </w:r>
-                    <w:r>
-                      <w:rPr>
-                        <w:rFonts w:eastAsiaTheme="majorEastAsia" w:cstheme="minorHAnsi"/>
-                        <w:sz w:val="80"/>
-                        <w:szCs w:val="80"/>
-                      </w:rPr>
-                      <w:t xml:space="preserve"> </w:t>
-                    </w:r>
-                    <w:r>
-                      <w:rPr>
-                        <w:rFonts w:eastAsiaTheme="majorEastAsia" w:cstheme="minorHAnsi"/>
-                        <w:sz w:val="80"/>
-                        <w:szCs w:val="80"/>
-                      </w:rPr>
-                      <w:t xml:space="preserve">Proyecto </w:t>
-                    </w:r>
-                    <w:r>
-                      <w:rPr>
-                        <w:rFonts w:eastAsiaTheme="majorEastAsia" w:cstheme="minorHAnsi"/>
-                        <w:sz w:val="80"/>
-                        <w:szCs w:val="80"/>
-                      </w:rPr>
-                      <w:t xml:space="preserve">ALBEDO </w:t>
-                    </w:r>
-                    <w:proofErr w:type="spellStart"/>
-                    <w:r>
-                      <w:rPr>
-                        <w:rFonts w:eastAsiaTheme="majorEastAsia" w:cstheme="minorHAnsi"/>
-                        <w:sz w:val="80"/>
-                        <w:szCs w:val="80"/>
-                      </w:rPr>
-                      <w:t>Outdoor</w:t>
-                    </w:r>
-                    <w:proofErr w:type="spellEnd"/>
                   </w:p>
                 </w:tc>
               </w:sdtContent>
@@ -338,7 +296,7 @@
               <wp:inline distT="0" distB="0" distL="0" distR="0" wp14:anchorId="63C4AC39" wp14:editId="0B0FE7D1">
                 <wp:extent cx="4058216" cy="2095792"/>
                 <wp:effectExtent l="0" t="0" r="0" b="0"/>
-                <wp:docPr id="132742347" name="Imagen 1" descr="Logotipo&#10;&#10;Descripción generada automáticamente"/>
+                <wp:docPr id="132742347" name="Imagen 1" descr="Logotipo  Descripción generada automáticamente"/>
                 <wp:cNvGraphicFramePr>
                   <a:graphicFrameLocks xmlns:a="http://schemas.openxmlformats.org/drawingml/2006/main" noChangeAspect="1"/>
                 </wp:cNvGraphicFramePr>
@@ -346,7 +304,7 @@
                   <a:graphicData uri="http://schemas.openxmlformats.org/drawingml/2006/picture">
                     <pic:pic xmlns:pic="http://schemas.openxmlformats.org/drawingml/2006/picture">
                       <pic:nvPicPr>
-                        <pic:cNvPr id="132742347" name="Imagen 1" descr="Logotipo&#10;&#10;Descripción generada automáticamente"/>
+                        <pic:cNvPr id="132742347" name="Imagen 1" descr="Logotipo  Descripción generada automáticamente"/>
                         <pic:cNvPicPr/>
                       </pic:nvPicPr>
                       <pic:blipFill>
@@ -383,23 +341,8 @@
               <w:rFonts w:cstheme="minorHAnsi"/>
             </w:rPr>
             <w:tab/>
-          </w:r>
-          <w:r>
-            <w:rPr>
-              <w:rFonts w:cstheme="minorHAnsi"/>
-            </w:rPr>
             <w:tab/>
-          </w:r>
-          <w:r>
-            <w:rPr>
-              <w:rFonts w:cstheme="minorHAnsi"/>
-            </w:rPr>
             <w:tab/>
-          </w:r>
-          <w:r>
-            <w:rPr>
-              <w:rFonts w:cstheme="minorHAnsi"/>
-            </w:rPr>
             <w:tab/>
           </w:r>
         </w:p>
@@ -423,59 +366,14 @@
               <w:rFonts w:cstheme="minorHAnsi"/>
             </w:rPr>
             <w:tab/>
-          </w:r>
-          <w:r>
-            <w:rPr>
-              <w:rFonts w:cstheme="minorHAnsi"/>
-            </w:rPr>
             <w:tab/>
-          </w:r>
-          <w:r>
-            <w:rPr>
-              <w:rFonts w:cstheme="minorHAnsi"/>
-            </w:rPr>
             <w:tab/>
-          </w:r>
-          <w:r>
-            <w:rPr>
-              <w:rFonts w:cstheme="minorHAnsi"/>
-            </w:rPr>
             <w:tab/>
-          </w:r>
-          <w:r>
-            <w:rPr>
-              <w:rFonts w:cstheme="minorHAnsi"/>
-            </w:rPr>
             <w:tab/>
-          </w:r>
-          <w:r>
-            <w:rPr>
-              <w:rFonts w:cstheme="minorHAnsi"/>
-            </w:rPr>
             <w:tab/>
-          </w:r>
-          <w:r>
-            <w:rPr>
-              <w:rFonts w:cstheme="minorHAnsi"/>
-            </w:rPr>
             <w:tab/>
-          </w:r>
-          <w:r>
-            <w:rPr>
-              <w:rFonts w:cstheme="minorHAnsi"/>
-            </w:rPr>
             <w:tab/>
-          </w:r>
-          <w:r>
-            <w:rPr>
-              <w:rFonts w:cstheme="minorHAnsi"/>
-            </w:rPr>
             <w:tab/>
-          </w:r>
-          <w:r>
-            <w:rPr>
-              <w:rFonts w:cstheme="minorHAnsi"/>
-            </w:rPr>
             <w:tab/>
             <w:t>Luis Roa</w:t>
           </w:r>
@@ -492,59 +390,14 @@
               <w:rFonts w:cstheme="minorHAnsi"/>
             </w:rPr>
             <w:tab/>
-          </w:r>
-          <w:r>
-            <w:rPr>
-              <w:rFonts w:cstheme="minorHAnsi"/>
-            </w:rPr>
             <w:tab/>
-          </w:r>
-          <w:r>
-            <w:rPr>
-              <w:rFonts w:cstheme="minorHAnsi"/>
-            </w:rPr>
             <w:tab/>
-          </w:r>
-          <w:r>
-            <w:rPr>
-              <w:rFonts w:cstheme="minorHAnsi"/>
-            </w:rPr>
             <w:tab/>
-          </w:r>
-          <w:r>
-            <w:rPr>
-              <w:rFonts w:cstheme="minorHAnsi"/>
-            </w:rPr>
             <w:tab/>
-          </w:r>
-          <w:r>
-            <w:rPr>
-              <w:rFonts w:cstheme="minorHAnsi"/>
-            </w:rPr>
             <w:tab/>
-          </w:r>
-          <w:r>
-            <w:rPr>
-              <w:rFonts w:cstheme="minorHAnsi"/>
-            </w:rPr>
             <w:tab/>
-          </w:r>
-          <w:r>
-            <w:rPr>
-              <w:rFonts w:cstheme="minorHAnsi"/>
-            </w:rPr>
             <w:tab/>
-          </w:r>
-          <w:r>
-            <w:rPr>
-              <w:rFonts w:cstheme="minorHAnsi"/>
-            </w:rPr>
             <w:tab/>
-          </w:r>
-          <w:r>
-            <w:rPr>
-              <w:rFonts w:cstheme="minorHAnsi"/>
-            </w:rPr>
             <w:tab/>
             <w:t>Claudio Córdova</w:t>
           </w:r>
@@ -1077,10 +930,7 @@
           </w:tcPr>
           <w:p>
             <w:r>
-              <w:t>09</w:t>
-            </w:r>
-            <w:r>
-              <w:t>-09-2026</w:t>
+              <w:t>09-09-2026</w:t>
             </w:r>
           </w:p>
         </w:tc>
@@ -1154,10 +1004,7 @@
           </w:tcPr>
           <w:p>
             <w:r>
-              <w:t>13</w:t>
-            </w:r>
-            <w:r>
-              <w:t>-09-2026</w:t>
+              <w:t>13-09-2026</w:t>
             </w:r>
           </w:p>
         </w:tc>
@@ -1174,10 +1021,7 @@
           </w:tcPr>
           <w:p>
             <w:r>
-              <w:t>2</w:t>
-            </w:r>
-            <w:r>
-              <w:t>.0</w:t>
+              <w:t>2.0</w:t>
             </w:r>
           </w:p>
         </w:tc>
@@ -1234,13 +1078,7 @@
           </w:tcPr>
           <w:p>
             <w:r>
-              <w:t>1</w:t>
-            </w:r>
-            <w:r>
-              <w:t>4</w:t>
-            </w:r>
-            <w:r>
-              <w:t>-09-2026</w:t>
+              <w:t>14-09-2026</w:t>
             </w:r>
           </w:p>
         </w:tc>
@@ -1913,7 +1751,7 @@
         <w:ind w:left="340" w:hanging="170"/>
       </w:pPr>
       <w:r>
-        <w:t>• Registro de usuario e inicio de sesión con sus validaciones.</w:t>
+        <w:t>• Registro de usuario con sus validaciones.</w:t>
       </w:r>
     </w:p>
     <w:p>
@@ -1934,26 +1772,6 @@
       </w:pPr>
       <w:r>
         <w:t>• Blog y dos vistas de detalle de blog.</w:t>
-      </w:r>
-    </w:p>
-    <w:p>
-      <w:pPr>
-        <w:pStyle w:val="Prrafodelista"/>
-        <w:spacing w:after="60"/>
-        <w:ind w:left="340" w:hanging="170"/>
-      </w:pPr>
-      <w:r>
-        <w:t>• Detalle de producto y botón para añadir productos.</w:t>
-      </w:r>
-    </w:p>
-    <w:p>
-      <w:pPr>
-        <w:pStyle w:val="Prrafodelista"/>
-        <w:spacing w:after="60"/>
-        <w:ind w:left="340" w:hanging="170"/>
-      </w:pPr>
-      <w:r>
-        <w:t>• Carrito de compras con persistencia en localStorage.</w:t>
       </w:r>
     </w:p>
     <w:p>
@@ -2745,6 +2563,309 @@
                 <w:sz w:val="18"/>
               </w:rPr>
               <w:t>El sistema debe validar con JavaScript: nombre requerido (máx. 100), correo de máx. 100 con dominios @duoc.cl, @profesor.duoc.cl o @gmail.com, y comentario requerido (máx. 500). Debe mostrar mensajes de error o confirmación.</w:t>
+            </w:r>
+          </w:p>
+        </w:tc>
+        <w:tc>
+          <w:tcPr>
+            <w:tcW w:w="1361" w:type="dxa"/>
+            <w:tcMar>
+              <w:top w:w="60" w:type="dxa"/>
+              <w:left w:w="60" w:type="dxa"/>
+              <w:bottom w:w="60" w:type="dxa"/>
+              <w:right w:w="60" w:type="dxa"/>
+            </w:tcMar>
+          </w:tcPr>
+          <w:p>
+            <w:r>
+              <w:rPr>
+                <w:sz w:val="18"/>
+              </w:rPr>
+              <w:t>Implementado</w:t>
+            </w:r>
+          </w:p>
+        </w:tc>
+      </w:tr>
+      <w:tr>
+        <w:trPr>
+          <w:cantSplit/>
+          <w:jc w:val="center"/>
+        </w:trPr>
+        <w:tc>
+          <w:tcPr>
+            <w:tcW w:w="850" w:type="dxa"/>
+            <w:tcMar>
+              <w:top w:w="60" w:type="dxa"/>
+              <w:left w:w="60" w:type="dxa"/>
+              <w:bottom w:w="60" w:type="dxa"/>
+              <w:right w:w="60" w:type="dxa"/>
+            </w:tcMar>
+          </w:tcPr>
+          <w:p>
+            <w:r>
+              <w:rPr>
+                <w:sz w:val="18"/>
+              </w:rPr>
+              <w:t>RF-06</w:t>
+            </w:r>
+          </w:p>
+        </w:tc>
+        <w:tc>
+          <w:tcPr>
+            <w:tcW w:w="1928" w:type="dxa"/>
+            <w:tcMar>
+              <w:top w:w="60" w:type="dxa"/>
+              <w:left w:w="60" w:type="dxa"/>
+              <w:bottom w:w="60" w:type="dxa"/>
+              <w:right w:w="60" w:type="dxa"/>
+            </w:tcMar>
+          </w:tcPr>
+          <w:p>
+            <w:r>
+              <w:rPr>
+                <w:sz w:val="18"/>
+              </w:rPr>
+              <w:t>Detalle de producto</w:t>
+            </w:r>
+          </w:p>
+        </w:tc>
+        <w:tc>
+          <w:tcPr>
+            <w:tcW w:w="1304" w:type="dxa"/>
+            <w:tcMar>
+              <w:top w:w="60" w:type="dxa"/>
+              <w:left w:w="60" w:type="dxa"/>
+              <w:bottom w:w="60" w:type="dxa"/>
+              <w:right w:w="60" w:type="dxa"/>
+            </w:tcMar>
+          </w:tcPr>
+          <w:p>
+            <w:r>
+              <w:rPr>
+                <w:sz w:val="18"/>
+              </w:rPr>
+              <w:t>Cliente</w:t>
+            </w:r>
+          </w:p>
+        </w:tc>
+        <w:tc>
+          <w:tcPr>
+            <w:tcW w:w="5272" w:type="dxa"/>
+            <w:tcMar>
+              <w:top w:w="60" w:type="dxa"/>
+              <w:left w:w="60" w:type="dxa"/>
+              <w:bottom w:w="60" w:type="dxa"/>
+              <w:right w:w="60" w:type="dxa"/>
+            </w:tcMar>
+          </w:tcPr>
+          <w:p>
+            <w:r>
+              <w:rPr>
+                <w:sz w:val="18"/>
+              </w:rPr>
+              <w:t>El sistema debe redireccionar a una vista de detalle al seleccionar un producto desde el catálogo, mostrando su imagen, nombre, precio, descripción y colores disponibles, junto con un botón para añadirlo al carrito de compras.</w:t>
+            </w:r>
+          </w:p>
+        </w:tc>
+        <w:tc>
+          <w:tcPr>
+            <w:tcW w:w="1361" w:type="dxa"/>
+            <w:tcMar>
+              <w:top w:w="60" w:type="dxa"/>
+              <w:left w:w="60" w:type="dxa"/>
+              <w:bottom w:w="60" w:type="dxa"/>
+              <w:right w:w="60" w:type="dxa"/>
+            </w:tcMar>
+          </w:tcPr>
+          <w:p>
+            <w:r>
+              <w:rPr>
+                <w:sz w:val="18"/>
+              </w:rPr>
+              <w:t>Implementado</w:t>
+            </w:r>
+          </w:p>
+        </w:tc>
+      </w:tr>
+      <w:tr>
+        <w:trPr>
+          <w:cantSplit/>
+          <w:jc w:val="center"/>
+        </w:trPr>
+        <w:tc>
+          <w:tcPr>
+            <w:tcW w:w="850" w:type="dxa"/>
+            <w:tcMar>
+              <w:top w:w="60" w:type="dxa"/>
+              <w:left w:w="60" w:type="dxa"/>
+              <w:bottom w:w="60" w:type="dxa"/>
+              <w:right w:w="60" w:type="dxa"/>
+            </w:tcMar>
+          </w:tcPr>
+          <w:p>
+            <w:r>
+              <w:rPr>
+                <w:sz w:val="18"/>
+              </w:rPr>
+              <w:t>RF-07</w:t>
+            </w:r>
+          </w:p>
+        </w:tc>
+        <w:tc>
+          <w:tcPr>
+            <w:tcW w:w="1928" w:type="dxa"/>
+            <w:tcMar>
+              <w:top w:w="60" w:type="dxa"/>
+              <w:left w:w="60" w:type="dxa"/>
+              <w:bottom w:w="60" w:type="dxa"/>
+              <w:right w:w="60" w:type="dxa"/>
+            </w:tcMar>
+          </w:tcPr>
+          <w:p>
+            <w:r>
+              <w:rPr>
+                <w:sz w:val="18"/>
+              </w:rPr>
+              <w:t>Carrito de compras</w:t>
+            </w:r>
+          </w:p>
+        </w:tc>
+        <w:tc>
+          <w:tcPr>
+            <w:tcW w:w="1304" w:type="dxa"/>
+            <w:tcMar>
+              <w:top w:w="60" w:type="dxa"/>
+              <w:left w:w="60" w:type="dxa"/>
+              <w:bottom w:w="60" w:type="dxa"/>
+              <w:right w:w="60" w:type="dxa"/>
+            </w:tcMar>
+          </w:tcPr>
+          <w:p>
+            <w:r>
+              <w:rPr>
+                <w:sz w:val="18"/>
+              </w:rPr>
+              <w:t>Cliente</w:t>
+            </w:r>
+          </w:p>
+        </w:tc>
+        <w:tc>
+          <w:tcPr>
+            <w:tcW w:w="5272" w:type="dxa"/>
+            <w:tcMar>
+              <w:top w:w="60" w:type="dxa"/>
+              <w:left w:w="60" w:type="dxa"/>
+              <w:bottom w:w="60" w:type="dxa"/>
+              <w:right w:w="60" w:type="dxa"/>
+            </w:tcMar>
+          </w:tcPr>
+          <w:p>
+            <w:r>
+              <w:rPr>
+                <w:sz w:val="18"/>
+              </w:rPr>
+              <w:t>El sistema debe permitir añadir productos al carrito, modificar la cantidad, eliminar productos y vaciar el carrito, manteniendo la información del carrito mediante localStorage.</w:t>
+            </w:r>
+          </w:p>
+        </w:tc>
+        <w:tc>
+          <w:tcPr>
+            <w:tcW w:w="1361" w:type="dxa"/>
+            <w:tcMar>
+              <w:top w:w="60" w:type="dxa"/>
+              <w:left w:w="60" w:type="dxa"/>
+              <w:bottom w:w="60" w:type="dxa"/>
+              <w:right w:w="60" w:type="dxa"/>
+            </w:tcMar>
+          </w:tcPr>
+          <w:p>
+            <w:r>
+              <w:rPr>
+                <w:sz w:val="18"/>
+              </w:rPr>
+              <w:t>Implementado</w:t>
+            </w:r>
+          </w:p>
+        </w:tc>
+      </w:tr>
+      <w:tr>
+        <w:trPr>
+          <w:cantSplit/>
+          <w:jc w:val="center"/>
+        </w:trPr>
+        <w:tc>
+          <w:tcPr>
+            <w:tcW w:w="850" w:type="dxa"/>
+            <w:tcMar>
+              <w:top w:w="60" w:type="dxa"/>
+              <w:left w:w="60" w:type="dxa"/>
+              <w:bottom w:w="60" w:type="dxa"/>
+              <w:right w:w="60" w:type="dxa"/>
+            </w:tcMar>
+          </w:tcPr>
+          <w:p>
+            <w:r>
+              <w:rPr>
+                <w:sz w:val="18"/>
+              </w:rPr>
+              <w:t>RF-08</w:t>
+            </w:r>
+          </w:p>
+        </w:tc>
+        <w:tc>
+          <w:tcPr>
+            <w:tcW w:w="1928" w:type="dxa"/>
+            <w:tcMar>
+              <w:top w:w="60" w:type="dxa"/>
+              <w:left w:w="60" w:type="dxa"/>
+              <w:bottom w:w="60" w:type="dxa"/>
+              <w:right w:w="60" w:type="dxa"/>
+            </w:tcMar>
+          </w:tcPr>
+          <w:p>
+            <w:r>
+              <w:rPr>
+                <w:sz w:val="18"/>
+              </w:rPr>
+              <w:t>Inicio de sesión</w:t>
+            </w:r>
+          </w:p>
+        </w:tc>
+        <w:tc>
+          <w:tcPr>
+            <w:tcW w:w="1304" w:type="dxa"/>
+            <w:tcMar>
+              <w:top w:w="60" w:type="dxa"/>
+              <w:left w:w="60" w:type="dxa"/>
+              <w:bottom w:w="60" w:type="dxa"/>
+              <w:right w:w="60" w:type="dxa"/>
+            </w:tcMar>
+          </w:tcPr>
+          <w:p>
+            <w:r>
+              <w:rPr>
+                <w:sz w:val="18"/>
+              </w:rPr>
+              <w:t>Cliente</w:t>
+            </w:r>
+          </w:p>
+        </w:tc>
+        <w:tc>
+          <w:tcPr>
+            <w:tcW w:w="5272" w:type="dxa"/>
+            <w:tcMar>
+              <w:top w:w="60" w:type="dxa"/>
+              <w:left w:w="60" w:type="dxa"/>
+              <w:bottom w:w="60" w:type="dxa"/>
+              <w:right w:w="60" w:type="dxa"/>
+            </w:tcMar>
+          </w:tcPr>
+          <w:p>
+            <w:r>
+              <w:rPr>
+                <w:sz w:val="18"/>
+              </w:rPr>
+              <w:t>El sistema debe validar con JavaScript el inicio de sesión: correo requerido de máximo 100 caracteres con dominios @duoc.cl, @profesor.duoc.cl o @gmail.com, y contraseña requerida de entre 4 y 10 caracteres. Debe mostrar mensajes de error o confirmación.</w:t>
             </w:r>
           </w:p>
         </w:tc>

</xml_diff>